<commit_message>
Rename "focus areas" to "Projects" and simplify content forms
- Website: research content collection renamed research → projects;
  Research page heading, eyebrows, and homepage section now say
  "Projects" (nav item stays "Research"). Same 3-item structure.
- Member Word form simplified to three short sections plus a PI block,
  with a 3-4 sentence "A bit about you" field for personality and
  "Project(s)" wording.
- Workbook: "Research Areas" sheet → "Projects", "Research area"
  column → "Project".
- Importer updated to the new sheet/column/folder names, and its
  example-row detection tightened to a per-sheet key column so a real
  publication tagged with an example project name is no longer skipped.

Co-Authored-By: Claude Opus 4.8 <noreply@anthropic.com>
</commit_message>
<xml_diff>
--- a/content-forms/Kuo-Lab-Member-Profile-Form.docx
+++ b/content-forms/Kuo-Lab-Member-Profile-Form.docx
@@ -15,7 +15,7 @@
           <w:sz w:val="36"/>
           <w:szCs w:val="36"/>
         </w:rPr>
-        <w:t xml:space="preserve">The Kuo Lab — Website Profile Form</w:t>
+        <w:t xml:space="preserve">The Kuo Lab — Website Profile</w:t>
       </w:r>
     </w:p>
     <w:p>
@@ -48,7 +48,7 @@
           <w:sz w:val="20"/>
           <w:szCs w:val="20"/>
         </w:rPr>
-        <w:t xml:space="preserve">We are building the lab’s new website and need a short profile from each member. Please fill in the boxes below (typing directly into this document is fine), then email it back along with your photo. It should take about five minutes.</w:t>
+        <w:t xml:space="preserve">Fill in the boxes below (type right into this document), then email it back with one photo of yourself. Takes about five minutes. Anything you leave blank simply won’t appear on the site.</w:t>
       </w:r>
     </w:p>
     <w:p>
@@ -64,7 +64,7 @@
           <w:sz w:val="26"/>
           <w:szCs w:val="26"/>
         </w:rPr>
-        <w:t xml:space="preserve">1. Your details</w:t>
+        <w:t xml:space="preserve">About you</w:t>
       </w:r>
     </w:p>
     <w:tbl>
@@ -130,7 +130,7 @@
                 <w:sz w:val="16"/>
                 <w:szCs w:val="16"/>
               </w:rPr>
-              <w:t xml:space="preserve">Exactly as you want it displayed on the site</w:t>
+              <w:t xml:space="preserve">As you want it shown on the site</w:t>
             </w:r>
           </w:p>
         </w:tc>
@@ -196,7 +196,7 @@
                 <w:sz w:val="20"/>
                 <w:szCs w:val="20"/>
               </w:rPr>
-              <w:t xml:space="preserve">Position / Title</w:t>
+              <w:t xml:space="preserve">Position</w:t>
             </w:r>
           </w:p>
           <w:p>
@@ -212,7 +212,7 @@
                 <w:sz w:val="16"/>
                 <w:szCs w:val="16"/>
               </w:rPr>
-              <w:t xml:space="preserve">e.g. PhD Student, Postdoctoral Researcher, Lab Manager, Undergraduate Researcher</w:t>
+              <w:t xml:space="preserve">e.g. PhD Student, Postdoc, Lab Manager, Undergrad Researcher</w:t>
             </w:r>
           </w:p>
         </w:tc>
@@ -278,7 +278,7 @@
                 <w:sz w:val="20"/>
                 <w:szCs w:val="20"/>
               </w:rPr>
-              <w:t xml:space="preserve">Research area(s)</w:t>
+              <w:t xml:space="preserve">Project(s)</w:t>
             </w:r>
           </w:p>
           <w:p>
@@ -294,7 +294,7 @@
                 <w:sz w:val="16"/>
                 <w:szCs w:val="16"/>
               </w:rPr>
-              <w:t xml:space="preserve">Choose from: Gene Expression &amp; Regulation • Chromatin &amp; Epigenetics • Cell Growth &amp; Signaling (list all that apply)</w:t>
+              <w:t xml:space="preserve">Which project(s) you work on: Gene Expression &amp; Regulation • Chromatin &amp; Epigenetics • Cell Growth &amp; Signaling</w:t>
             </w:r>
           </w:p>
         </w:tc>
@@ -360,7 +360,7 @@
                 <w:sz w:val="20"/>
                 <w:szCs w:val="20"/>
               </w:rPr>
-              <w:t xml:space="preserve">Short bio</w:t>
+              <w:t xml:space="preserve">A bit about you</w:t>
             </w:r>
           </w:p>
           <w:p>
@@ -376,7 +376,7 @@
                 <w:sz w:val="16"/>
                 <w:szCs w:val="16"/>
               </w:rPr>
-              <w:t xml:space="preserve">1–2 sentences, plain language: what do you work on and why is it interesting?</w:t>
+              <w:t xml:space="preserve">3–4 sentences: what are you interested in, what are you working on, and anything that shows a bit of personality</w:t>
             </w:r>
           </w:p>
         </w:tc>
@@ -396,6 +396,38 @@
               <w:right w:type="dxa" w:w="120"/>
             </w:tcMar>
           </w:tcPr>
+          <w:p>
+            <w:pPr>
+              <w:pBdr>
+                <w:bottom w:val="dotted" w:color="AAB5B1" w:sz="4"/>
+              </w:pBdr>
+              <w:spacing w:after="120" w:before="120"/>
+            </w:pPr>
+            <w:r>
+              <w:rPr>
+                <w:rFonts w:ascii="Arial" w:cs="Arial" w:eastAsia="Arial" w:hAnsi="Arial"/>
+                <w:sz w:val="22"/>
+                <w:szCs w:val="22"/>
+              </w:rPr>
+              <w:t xml:space="preserve"> </w:t>
+            </w:r>
+          </w:p>
+          <w:p>
+            <w:pPr>
+              <w:pBdr>
+                <w:bottom w:val="dotted" w:color="AAB5B1" w:sz="4"/>
+              </w:pBdr>
+              <w:spacing w:after="120" w:before="120"/>
+            </w:pPr>
+            <w:r>
+              <w:rPr>
+                <w:rFonts w:ascii="Arial" w:cs="Arial" w:eastAsia="Arial" w:hAnsi="Arial"/>
+                <w:sz w:val="22"/>
+                <w:szCs w:val="22"/>
+              </w:rPr>
+              <w:t xml:space="preserve"> </w:t>
+            </w:r>
+          </w:p>
           <w:p>
             <w:pPr>
               <w:pBdr>
@@ -457,7 +489,7 @@
           <w:sz w:val="26"/>
           <w:szCs w:val="26"/>
         </w:rPr>
-        <w:t xml:space="preserve">2. Contact &amp; links (all optional)</w:t>
+        <w:t xml:space="preserve">Contact (optional)</w:t>
       </w:r>
     </w:p>
     <w:p>
@@ -473,7 +505,7 @@
           <w:sz w:val="20"/>
           <w:szCs w:val="20"/>
         </w:rPr>
-        <w:t xml:space="preserve">Only what you list here will appear publicly. Leave anything blank to keep it off the website.</w:t>
+        <w:t xml:space="preserve">Only what you add here appears publicly — leave blank to keep it off the site.</w:t>
       </w:r>
     </w:p>
     <w:tbl>
@@ -523,7 +555,7 @@
                 <w:sz w:val="20"/>
                 <w:szCs w:val="20"/>
               </w:rPr>
-              <w:t xml:space="preserve">Email address</w:t>
+              <w:t xml:space="preserve">Email</w:t>
             </w:r>
           </w:p>
           <w:p>
@@ -539,7 +571,7 @@
                 <w:sz w:val="16"/>
                 <w:szCs w:val="16"/>
               </w:rPr>
-              <w:t xml:space="preserve">Write “do not publish” if you prefer it not be shown</w:t>
+              <w:t xml:space="preserve">Write “do not publish” if you’d rather not show it</w:t>
             </w:r>
           </w:p>
         </w:tc>
@@ -594,7 +626,7 @@
           </w:tcPr>
           <w:p>
             <w:pPr>
-              <w:spacing w:after="60" w:before="60"/>
+              <w:spacing w:after="20" w:before="60"/>
             </w:pPr>
             <w:r>
               <w:rPr>
@@ -605,7 +637,23 @@
                 <w:sz w:val="20"/>
                 <w:szCs w:val="20"/>
               </w:rPr>
-              <w:t xml:space="preserve">Personal website</w:t>
+              <w:t xml:space="preserve">Links</w:t>
+            </w:r>
+          </w:p>
+          <w:p>
+            <w:pPr>
+              <w:spacing w:after="60"/>
+            </w:pPr>
+            <w:r>
+              <w:rPr>
+                <w:rFonts w:ascii="Arial" w:cs="Arial" w:eastAsia="Arial" w:hAnsi="Arial"/>
+                <w:i/>
+                <w:iCs/>
+                <w:color w:val="55605C"/>
+                <w:sz w:val="16"/>
+                <w:szCs w:val="16"/>
+              </w:rPr>
+              <w:t xml:space="preserve">Personal website or Google Scholar, if you have them</w:t>
             </w:r>
           </w:p>
         </w:tc>
@@ -627,136 +675,20 @@
           </w:tcPr>
           <w:p>
             <w:pPr>
-              <w:spacing w:after="120" w:before="120"/>
-            </w:pPr>
-            <w:r>
-              <w:rPr>
-                <w:rFonts w:ascii="Arial" w:cs="Arial" w:eastAsia="Arial" w:hAnsi="Arial"/>
-                <w:sz w:val="22"/>
-                <w:szCs w:val="22"/>
-              </w:rPr>
-              <w:t xml:space="preserve"> </w:t>
-            </w:r>
-          </w:p>
-        </w:tc>
-      </w:tr>
-      <w:tr>
-        <w:tc>
-          <w:tcPr>
-            <w:tcW w:type="dxa" w:w="2900"/>
-            <w:tcBorders>
-              <w:top w:val="single" w:color="C3CCC9" w:sz="4"/>
-              <w:left w:val="single" w:color="C3CCC9" w:sz="4"/>
-              <w:bottom w:val="single" w:color="C3CCC9" w:sz="4"/>
-              <w:right w:val="single" w:color="C3CCC9" w:sz="4"/>
-            </w:tcBorders>
-            <w:shd w:fill="E7F1EC" w:val="clear"/>
-            <w:tcMar>
-              <w:top w:type="dxa" w:w="80"/>
-              <w:left w:type="dxa" w:w="120"/>
-              <w:bottom w:type="dxa" w:w="80"/>
-              <w:right w:type="dxa" w:w="120"/>
-            </w:tcMar>
-          </w:tcPr>
-          <w:p>
-            <w:pPr>
-              <w:spacing w:after="60" w:before="60"/>
-            </w:pPr>
-            <w:r>
-              <w:rPr>
-                <w:rFonts w:ascii="Arial" w:cs="Arial" w:eastAsia="Arial" w:hAnsi="Arial"/>
-                <w:b/>
-                <w:bCs/>
-                <w:color w:val="18453B"/>
-                <w:sz w:val="20"/>
-                <w:szCs w:val="20"/>
-              </w:rPr>
-              <w:t xml:space="preserve">Google Scholar link</w:t>
-            </w:r>
-          </w:p>
-        </w:tc>
-        <w:tc>
-          <w:tcPr>
-            <w:tcW w:type="dxa" w:w="6460"/>
-            <w:tcBorders>
-              <w:top w:val="single" w:color="C3CCC9" w:sz="4"/>
-              <w:left w:val="single" w:color="C3CCC9" w:sz="4"/>
-              <w:bottom w:val="single" w:color="C3CCC9" w:sz="4"/>
-              <w:right w:val="single" w:color="C3CCC9" w:sz="4"/>
-            </w:tcBorders>
-            <w:tcMar>
-              <w:top w:type="dxa" w:w="40"/>
-              <w:left w:type="dxa" w:w="120"/>
-              <w:bottom w:type="dxa" w:w="40"/>
-              <w:right w:type="dxa" w:w="120"/>
-            </w:tcMar>
-          </w:tcPr>
-          <w:p>
-            <w:pPr>
-              <w:spacing w:after="120" w:before="120"/>
-            </w:pPr>
-            <w:r>
-              <w:rPr>
-                <w:rFonts w:ascii="Arial" w:cs="Arial" w:eastAsia="Arial" w:hAnsi="Arial"/>
-                <w:sz w:val="22"/>
-                <w:szCs w:val="22"/>
-              </w:rPr>
-              <w:t xml:space="preserve"> </w:t>
-            </w:r>
-          </w:p>
-        </w:tc>
-      </w:tr>
-      <w:tr>
-        <w:tc>
-          <w:tcPr>
-            <w:tcW w:type="dxa" w:w="2900"/>
-            <w:tcBorders>
-              <w:top w:val="single" w:color="C3CCC9" w:sz="4"/>
-              <w:left w:val="single" w:color="C3CCC9" w:sz="4"/>
-              <w:bottom w:val="single" w:color="C3CCC9" w:sz="4"/>
-              <w:right w:val="single" w:color="C3CCC9" w:sz="4"/>
-            </w:tcBorders>
-            <w:shd w:fill="E7F1EC" w:val="clear"/>
-            <w:tcMar>
-              <w:top w:type="dxa" w:w="80"/>
-              <w:left w:type="dxa" w:w="120"/>
-              <w:bottom w:type="dxa" w:w="80"/>
-              <w:right w:type="dxa" w:w="120"/>
-            </w:tcMar>
-          </w:tcPr>
-          <w:p>
-            <w:pPr>
-              <w:spacing w:after="60" w:before="60"/>
-            </w:pPr>
-            <w:r>
-              <w:rPr>
-                <w:rFonts w:ascii="Arial" w:cs="Arial" w:eastAsia="Arial" w:hAnsi="Arial"/>
-                <w:b/>
-                <w:bCs/>
-                <w:color w:val="18453B"/>
-                <w:sz w:val="20"/>
-                <w:szCs w:val="20"/>
-              </w:rPr>
-              <w:t xml:space="preserve">LinkedIn</w:t>
-            </w:r>
-          </w:p>
-        </w:tc>
-        <w:tc>
-          <w:tcPr>
-            <w:tcW w:type="dxa" w:w="6460"/>
-            <w:tcBorders>
-              <w:top w:val="single" w:color="C3CCC9" w:sz="4"/>
-              <w:left w:val="single" w:color="C3CCC9" w:sz="4"/>
-              <w:bottom w:val="single" w:color="C3CCC9" w:sz="4"/>
-              <w:right w:val="single" w:color="C3CCC9" w:sz="4"/>
-            </w:tcBorders>
-            <w:tcMar>
-              <w:top w:type="dxa" w:w="40"/>
-              <w:left w:type="dxa" w:w="120"/>
-              <w:bottom w:type="dxa" w:w="40"/>
-              <w:right w:type="dxa" w:w="120"/>
-            </w:tcMar>
-          </w:tcPr>
+              <w:pBdr>
+                <w:bottom w:val="dotted" w:color="AAB5B1" w:sz="4"/>
+              </w:pBdr>
+              <w:spacing w:after="120" w:before="120"/>
+            </w:pPr>
+            <w:r>
+              <w:rPr>
+                <w:rFonts w:ascii="Arial" w:cs="Arial" w:eastAsia="Arial" w:hAnsi="Arial"/>
+                <w:sz w:val="22"/>
+                <w:szCs w:val="22"/>
+              </w:rPr>
+              <w:t xml:space="preserve"> </w:t>
+            </w:r>
+          </w:p>
           <w:p>
             <w:pPr>
               <w:spacing w:after="120" w:before="120"/>
@@ -786,7 +718,7 @@
           <w:sz w:val="26"/>
           <w:szCs w:val="26"/>
         </w:rPr>
-        <w:t xml:space="preserve">3. Your photo</w:t>
+        <w:t xml:space="preserve">Your photo</w:t>
       </w:r>
     </w:p>
     <w:p>
@@ -802,7 +734,7 @@
           <w:sz w:val="20"/>
           <w:szCs w:val="20"/>
         </w:rPr>
-        <w:t xml:space="preserve">Attach a photo to the same email as this form. Requirements:</w:t>
+        <w:t xml:space="preserve">Attach one photo to your reply email:</w:t>
       </w:r>
     </w:p>
     <w:p>
@@ -818,7 +750,7 @@
           <w:sz w:val="20"/>
           <w:szCs w:val="20"/>
         </w:rPr>
-        <w:t xml:space="preserve">•  Vertical (portrait) orientation — taller than it is wide</w:t>
+        <w:t xml:space="preserve">•  Vertical (portrait) — taller than it is wide</w:t>
       </w:r>
     </w:p>
     <w:p>
@@ -834,23 +766,7 @@
           <w:sz w:val="20"/>
           <w:szCs w:val="20"/>
         </w:rPr>
-        <w:t xml:space="preserve">•  At least 600 × 800 pixels (any modern phone photo is fine)</w:t>
-      </w:r>
-    </w:p>
-    <w:p>
-      <w:pPr>
-        <w:spacing w:after="100"/>
-      </w:pPr>
-      <w:r>
-        <w:rPr>
-          <w:rFonts w:ascii="Arial" w:cs="Arial" w:eastAsia="Arial" w:hAnsi="Arial"/>
-          <w:i w:val="false"/>
-          <w:iCs w:val="false"/>
-          <w:color w:val="55605C"/>
-          <w:sz w:val="20"/>
-          <w:szCs w:val="20"/>
-        </w:rPr>
-        <w:t xml:space="preserve">•  Plain background if possible; head and shoulders centered</w:t>
+        <w:t xml:space="preserve">•  A phone photo against a plain wall is perfectly fine</w:t>
       </w:r>
     </w:p>
     <w:p>
@@ -866,7 +782,7 @@
           <w:sz w:val="26"/>
           <w:szCs w:val="26"/>
         </w:rPr>
-        <w:t xml:space="preserve">4. Principal Investigator only</w:t>
+        <w:t xml:space="preserve">PI only</w:t>
       </w:r>
     </w:p>
     <w:p>
@@ -882,7 +798,7 @@
           <w:sz w:val="20"/>
           <w:szCs w:val="20"/>
         </w:rPr>
-        <w:t xml:space="preserve">Members can stop at Section 3. If you are the PI, please also provide:</w:t>
+        <w:t xml:space="preserve">Members can stop above. If you’re the PI, please also add:</w:t>
       </w:r>
     </w:p>
     <w:tbl>
@@ -932,7 +848,7 @@
                 <w:sz w:val="20"/>
                 <w:szCs w:val="20"/>
               </w:rPr>
-              <w:t xml:space="preserve">Extended bio</w:t>
+              <w:t xml:space="preserve">Longer bio</w:t>
             </w:r>
           </w:p>
           <w:p>
@@ -948,7 +864,7 @@
                 <w:sz w:val="16"/>
                 <w:szCs w:val="16"/>
               </w:rPr>
-              <w:t xml:space="preserve">2–3 paragraphs — feel free to attach separately or paste below</w:t>
+              <w:t xml:space="preserve">2–3 paragraphs (attach separately if easier)</w:t>
             </w:r>
           </w:p>
         </w:tc>
@@ -1062,7 +978,7 @@
                 <w:sz w:val="20"/>
                 <w:szCs w:val="20"/>
               </w:rPr>
-              <w:t xml:space="preserve">One-line mission statement</w:t>
+              <w:t xml:space="preserve">Lab mission</w:t>
             </w:r>
           </w:p>
           <w:p>
@@ -1078,7 +994,7 @@
                 <w:sz w:val="16"/>
                 <w:szCs w:val="16"/>
               </w:rPr>
-              <w:t xml:space="preserve">One sentence describing what the lab does — shown on the homepage</w:t>
+              <w:t xml:space="preserve">One sentence describing what the lab does — for the homepage</w:t>
             </w:r>
           </w:p>
         </w:tc>
@@ -1176,7 +1092,7 @@
                 <w:sz w:val="16"/>
                 <w:szCs w:val="16"/>
               </w:rPr>
-              <w:t xml:space="preserve">Attach as a PDF to your reply email</w:t>
+              <w:t xml:space="preserve">Attach as a PDF to your reply</w:t>
             </w:r>
           </w:p>
         </w:tc>

</xml_diff>